<commit_message>
docs: add concrete EvoMind clone commands
</commit_message>
<xml_diff>
--- a/docs/EvoMind_New_User_Final_Setup_Guide_20260707.docx
+++ b/docs/EvoMind_New_User_Final_Setup_Guide_20260707.docx
@@ -1368,7 +1368,7 @@
           <w:color w:val="000000"/>
           <w:sz w:val="18"/>
         </w:rPr>
-        <w:t>git clone &lt;你的GitHub仓库地址&gt; EvoMind</w:t>
+        <w:t>git clone https://github.com/hoanglenga2000-glitch/xcientist.git EvoMind</w:t>
         <w:br/>
         <w:t>cd EvoMind</w:t>
       </w:r>
@@ -4044,7 +4044,7 @@
           <w:color w:val="000000"/>
           <w:sz w:val="18"/>
         </w:rPr>
-        <w:t>git clone &lt;你的GitHub仓库地址&gt; EvoMind</w:t>
+        <w:t>git clone https://github.com/hoanglenga2000-glitch/xcientist.git EvoMind</w:t>
         <w:br/>
         <w:t>cd EvoMind</w:t>
         <w:br/>

</xml_diff>

<commit_message>
docs: clarify EvoMind download instructions
</commit_message>
<xml_diff>
--- a/docs/EvoMind_New_User_Final_Setup_Guide_20260707.docx
+++ b/docs/EvoMind_New_User_Final_Setup_Guide_20260707.docx
@@ -1351,23 +1351,41 @@
       <w:r>
         <w:rPr>
           <w:rFonts w:ascii="Microsoft YaHei" w:hAnsi="Microsoft YaHei" w:eastAsia="Microsoft YaHei"/>
+          <w:b/>
+          <w:color w:val="000000"/>
+          <w:sz w:val="23"/>
+        </w:rPr>
+        <w:t>3.1 ?????? Git ??</w:t>
+      </w:r>
+    </w:p>
+    <w:p>
+      <w:pPr>
+        <w:spacing w:before="60" w:after="120"/>
+        <w:ind w:left="283"/>
+      </w:pPr>
+      <w:r>
+        <w:rPr>
+          <w:rFonts w:ascii="Microsoft YaHei" w:hAnsi="Microsoft YaHei" w:eastAsia="Microsoft YaHei"/>
+          <w:b w:val="0"/>
           <w:color w:val="000000"/>
           <w:sz w:val="21"/>
         </w:rPr>
-        <w:t>从 GitHub 下载：</w:t>
-      </w:r>
-    </w:p>
-    <w:p>
-      <w:pPr>
-        <w:spacing w:before="60" w:after="120"/>
-        <w:ind w:left="283"/>
-      </w:pPr>
-      <w:r>
-        <w:rPr>
-          <w:rFonts w:ascii="Consolas" w:hAnsi="Consolas" w:eastAsia="Consolas"/>
-          <w:color w:val="000000"/>
-          <w:sz w:val="18"/>
-        </w:rPr>
+        <w:t>? Windows ??????????? PowerShell????????????????????</w:t>
+        <w:br/>
+        <w:t>cd $env:USERPROFILE\Desktop</w:t>
+        <w:br/>
+        <w:br/>
+        <w:t>?????????????? GitHub ?? EvoMind ?????????????</w:t>
+        <w:br/>
+        <w:t>git clone https://github.com/hoanglenga2000-glitch/xcientist.git EvoMind</w:t>
+        <w:br/>
+        <w:t>cd EvoMind</w:t>
+        <w:br/>
+        <w:br/>
+        <w:t>??????? D ??????????????????????</w:t>
+        <w:br/>
+        <w:t>cd D:\</w:t>
+        <w:br/>
         <w:t>git clone https://github.com/hoanglenga2000-glitch/xcientist.git EvoMind</w:t>
         <w:br/>
         <w:t>cd EvoMind</w:t>
@@ -1381,24 +1399,36 @@
       <w:r>
         <w:rPr>
           <w:rFonts w:ascii="Microsoft YaHei" w:hAnsi="Microsoft YaHei" w:eastAsia="Microsoft YaHei"/>
+          <w:b/>
+          <w:color w:val="000000"/>
+          <w:sz w:val="23"/>
+        </w:rPr>
+        <w:t>3.2 ?? Git ???? ZIP</w:t>
+      </w:r>
+    </w:p>
+    <w:p>
+      <w:pPr>
+        <w:spacing w:before="60" w:after="120"/>
+        <w:ind w:left="283"/>
+      </w:pPr>
+      <w:r>
+        <w:rPr>
+          <w:rFonts w:ascii="Microsoft YaHei" w:hAnsi="Microsoft YaHei" w:eastAsia="Microsoft YaHei"/>
+          <w:b w:val="0"/>
           <w:color w:val="000000"/>
           <w:sz w:val="21"/>
         </w:rPr>
-        <w:t>如果拿到的是压缩包，解压后进入项目根目录：</w:t>
-      </w:r>
-    </w:p>
-    <w:p>
-      <w:pPr>
-        <w:spacing w:before="60" w:after="120"/>
-        <w:ind w:left="283"/>
-      </w:pPr>
-      <w:r>
-        <w:rPr>
-          <w:rFonts w:ascii="Consolas" w:hAnsi="Consolas" w:eastAsia="Consolas"/>
-          <w:color w:val="000000"/>
-          <w:sz w:val="18"/>
-        </w:rPr>
-        <w:t>cd &lt;EvoMind项目目录&gt;</w:t>
+        <w:t>???????? Git?????????</w:t>
+        <w:br/>
+        <w:t>https://github.com/hoanglenga2000-glitch/xcientist</w:t>
+        <w:br/>
+        <w:br/>
+        <w:t>?? Code -&gt; Download ZIP?????????????????????? PowerShell??????????</w:t>
+        <w:br/>
+        <w:t>cd &lt;EvoMind????&gt;</w:t>
+        <w:br/>
+        <w:br/>
+        <w:t>???????????????</w:t>
       </w:r>
     </w:p>
     <w:p>

</xml_diff>